<commit_message>
Fix translation and nested table reconstruction
</commit_message>
<xml_diff>
--- a/backend/outputs/Image_hello_reconstructed_hi.docx
+++ b/backend/outputs/Image_hello_reconstructed_hi.docx
@@ -59,12 +59,12 @@
     </w:p>
     <w:p>
       <w:r>
-        <w:t>छवि</w:t>
+        <w:rPr/>
+        <w:t xml:space="preserve">                                                               </w:t>
       </w:r>
       <w:r>
-        <w:rPr>
-          <w:highlight w:val="yellow"/>
-        </w:rPr>
+        <w:rPr/>
+        <w:t>छवि</w:t>
       </w:r>
     </w:p>
     <w:sectPr>

</xml_diff>